<commit_message>
Publish rebuilt bilingual portfolio from source 1aeaf8c
</commit_message>
<xml_diff>
--- a/resume/Alan_Zhu_Resume_CN.docx
+++ b/resume/Alan_Zhu_Resume_CN.docx
@@ -61,6 +61,7 @@
     </w:p>
     <w:p>
       <w:pPr>
+        <w:keepNext/>
         <w:spacing w:before="160" w:after="80" w:line="259" w:lineRule="auto"/>
         <w:pBdr>
           <w:bottom w:val="single" w:sz="6" w:space="8" w:color="CFE1DE"/>
@@ -106,6 +107,7 @@
     </w:p>
     <w:p>
       <w:pPr>
+        <w:keepNext/>
         <w:spacing w:before="160" w:after="80" w:line="259" w:lineRule="auto"/>
         <w:pBdr>
           <w:bottom w:val="single" w:sz="6" w:space="8" w:color="CFE1DE"/>
@@ -213,6 +215,7 @@
     </w:p>
     <w:p>
       <w:pPr>
+        <w:keepNext/>
         <w:spacing w:before="160" w:after="80" w:line="259" w:lineRule="auto"/>
         <w:pBdr>
           <w:bottom w:val="single" w:sz="6" w:space="8" w:color="CFE1DE"/>
@@ -305,6 +308,7 @@
     </w:p>
     <w:p>
       <w:pPr>
+        <w:keepNext/>
         <w:spacing w:before="160" w:after="80" w:line="259" w:lineRule="auto"/>
         <w:pBdr>
           <w:bottom w:val="single" w:sz="6" w:space="8" w:color="CFE1DE"/>
@@ -322,6 +326,7 @@
     </w:p>
     <w:p>
       <w:pPr>
+        <w:keepNext/>
         <w:spacing w:before="120" w:after="40" w:line="259" w:lineRule="auto"/>
       </w:pPr>
       <w:r>
@@ -469,6 +474,7 @@
     </w:p>
     <w:p>
       <w:pPr>
+        <w:keepNext/>
         <w:spacing w:before="120" w:after="40" w:line="259" w:lineRule="auto"/>
       </w:pPr>
       <w:r>
@@ -557,6 +563,7 @@
     </w:p>
     <w:p>
       <w:pPr>
+        <w:keepNext/>
         <w:spacing w:before="120" w:after="40" w:line="259" w:lineRule="auto"/>
       </w:pPr>
       <w:r>
@@ -630,6 +637,7 @@
     </w:p>
     <w:p>
       <w:pPr>
+        <w:keepNext/>
         <w:spacing w:before="120" w:after="40" w:line="259" w:lineRule="auto"/>
       </w:pPr>
       <w:r>
@@ -688,6 +696,7 @@
     </w:p>
     <w:p>
       <w:pPr>
+        <w:keepNext/>
         <w:spacing w:before="160" w:after="80" w:line="259" w:lineRule="auto"/>
         <w:pBdr>
           <w:bottom w:val="single" w:sz="6" w:space="8" w:color="CFE1DE"/>
@@ -705,6 +714,7 @@
     </w:p>
     <w:p>
       <w:pPr>
+        <w:keepNext/>
         <w:spacing w:before="120" w:after="40" w:line="259" w:lineRule="auto"/>
       </w:pPr>
       <w:r>
@@ -775,6 +785,7 @@
     </w:p>
     <w:p>
       <w:pPr>
+        <w:keepNext/>
         <w:spacing w:before="120" w:after="40" w:line="259" w:lineRule="auto"/>
       </w:pPr>
       <w:r>
@@ -845,6 +856,7 @@
     </w:p>
     <w:p>
       <w:pPr>
+        <w:keepNext/>
         <w:spacing w:before="120" w:after="40" w:line="259" w:lineRule="auto"/>
       </w:pPr>
       <w:r>
@@ -901,6 +913,7 @@
     </w:p>
     <w:p>
       <w:pPr>
+        <w:keepNext/>
         <w:spacing w:before="120" w:after="40" w:line="259" w:lineRule="auto"/>
       </w:pPr>
       <w:r>
@@ -943,6 +956,7 @@
     </w:p>
     <w:p>
       <w:pPr>
+        <w:keepNext/>
         <w:spacing w:before="160" w:after="80" w:line="259" w:lineRule="auto"/>
         <w:pBdr>
           <w:bottom w:val="single" w:sz="6" w:space="8" w:color="CFE1DE"/>
@@ -1155,6 +1169,7 @@
     </w:p>
     <w:p>
       <w:pPr>
+        <w:keepNext/>
         <w:spacing w:before="160" w:after="80" w:line="259" w:lineRule="auto"/>
         <w:pBdr>
           <w:bottom w:val="single" w:sz="6" w:space="8" w:color="CFE1DE"/>
@@ -1182,7 +1197,7 @@
           <w:b w:val="0"/>
           <w:sz w:val="19"/>
         </w:rPr>
-        <w:t>广东外语外贸大学 | 英语专业，自考本科 | 在读</w:t>
+        <w:t>广东外语外贸大学 | 英语自考学习经历（不代表已取得学位）</w:t>
       </w:r>
     </w:p>
     <w:p>
@@ -1217,6 +1232,7 @@
     </w:p>
     <w:p>
       <w:pPr>
+        <w:keepNext/>
         <w:spacing w:before="160" w:after="80" w:line="259" w:lineRule="auto"/>
         <w:pBdr>
           <w:bottom w:val="single" w:sz="6" w:space="8" w:color="CFE1DE"/>

</xml_diff>